<commit_message>
Improve figure readability and manuscript clarity
</commit_message>
<xml_diff>
--- a/SUBMISSION_PACKAGE/Manuscripts/01_Manuscript_FINAL_HIGHLIGHTED.docx
+++ b/SUBMISSION_PACKAGE/Manuscripts/01_Manuscript_FINAL_HIGHLIGHTED.docx
@@ -459,7 +459,7 @@
         <w:rPr>
           <w:highlight w:val="yellow"/>
         </w:rPr>
-        <w:t>Bag-in-Box (BiB) packaging can reduce the logistical and environmental burden of wine exports, but its behaviour under combined stacking and thermal stress is still poorly documented. This study monitored 3-L BiB units during a 20-day simulated export trial in two chambers nominally set to 19 °C and 50 °C, followed by a 15-day single-stack verification trial under a nominal 50 °C condition. In the main trial, the nominal 50 °C chamber did not produce 50 °C wine exposure: during the late storage window, in-bag temperatures averaged 34.18 ± 0.36 °C in top units and 26.08 ± 0.23 °C in bottom units, while the nominal 19 °C chamber averaged 23.50 ± 0.21 °C and 22.84 ± 0.30 °C in top and bottom units, respectively. Internal pressure rose after handling; individual post-handling peaks occurred between 85.0 and 138.5 h. In an exploratory sensor-level analysis, bottom-position BiBs had a larger peak baseline-referred pressure increase than top-position BiBs (adjusted difference 20.4 mbar; 95% CI 4.8-35.9 mbar; F(1,8) = 9.14; p = 0.017), whereas no statistically detectable nominal chamber-condition effect was observed. By day 20 neither sensor-level factor was statistically detectable. Bulk wine from the nominally warmer chamber showed lower free and total SO₂, higher volatile acidity and a numerically higher lactic-acid value after 20 days, but these summary chemistry data were not resolved by stack position and raw chemical replicates were unavailable. In the verification trial, sensor maxima ranged from 45.0 to 48.8 °C and no in-bag sensor reached 50 °C; pressure changes remained transient (9.6-26.5 mbar). The results support selected sentinel sensing to document actual package conditions and mechanically stressed positions, while highlighting the limits of inferring wine exposure from chamber set points alone.</w:t>
+        <w:t>Bag-in-Box (BiB) packaging can reduce the logistical and environmental burden of wine exports, but its behaviour under combined stacking and thermal stress is still poorly documented. This study monitored 3-L BiB units during a 20-day simulated export trial in two chambers nominally set to 19 °C and 50 °C, followed by a 15-day single-stack verification trial under a nominal 50 °C condition. In the main trial, the nominal 50 °C chamber did not produce 50 °C wine exposure. During the late storage window, in-bag temperatures averaged 34.18 ± 0.36 °C in top units and 26.08 ± 0.23 °C in bottom units. In the nominal 19 °C chamber, top and bottom units averaged 23.50 ± 0.21 °C and 22.84 ± 0.30 °C, respectively. Internal pressure rose after handling; individual post-handling peaks occurred between 85.0 and 138.5 h. In an exploratory sensor-level analysis, bottom-position BiBs had a larger peak baseline-referred pressure increase than top-position BiBs (adjusted difference 20.4 mbar; 95% CI 4.8-35.9 mbar; F(1,8) = 9.14; p = 0.017). No statistically detectable nominal chamber-condition effect was observed, and by day 20 neither sensor-level factor was statistically detectable. Bulk wine from the nominally warmer chamber showed lower free and total SO₂ and higher volatile acidity after 20 days. It also had a numerically higher lactic-acid value, but the summary chemistry data were not resolved by stack position and raw chemical replicates were unavailable. In the verification trial, sensor maxima ranged from 45.0 to 48.8 °C and no in-bag sensor reached 50 °C; pressure changes remained transient (9.6-26.5 mbar). The results support selected sentinel sensing to document actual package conditions and mechanically stressed positions, while highlighting the limits of inferring wine exposure from chamber set points alone.</w:t>
       </w:r>
     </w:p>
     <w:p>
@@ -1856,7 +1856,10 @@
         <w:ind w:left="2550"/>
       </w:pPr>
       <w:r>
-        <w:t>Pressure monitoring within the Bag-in-Box containers was carried out using custom-designed sensing units, as described in a previous study [19]. Each unit was built around an MS5803-05BA miniature altimeter module (TE Connectivity), a 24-bit MEMS pressure and temperature sensor with SPI and I2C interfaces. According to its data sheet [24] the device covers 0-5 bar and -40 to +85 °C, resolves pressure to between 0.036 and 0.195 mbar depending on the oversampling ratio and temperature to better than 0.01 °C, and is specified to ±1.5 mbar between 300 and 1100 mbar at 20 °C, widening to ±100 mbar over the whole 0-5 bar and 0-50 °C envelope, with a long-term stability of ±1 mbar per year and a temperature accuracy of ±2.5 °C. The sensor was driven by an ESP8285 microcontroller on an ESP-M2 board (Adafruit) [25] and powered by a lithium battery. The assembly was enclosed in an oil-filled plastic casing, the oil transmitting the pressure of the wine to the transducer while dispersing the small amount of heat released by the electronics, whose draw is below 1 mA. The casing was introduced into each bag through the existing filling/dispensing valve before the bag was finally sealed, so that the multilayer film was not punctured and the barrier integrity of the bag was preserved; sealing then followed the standard procedure of the filling line, which was intended to minimise leakage and artificial perturbation of the internal pressure.</w:t>
+        <w:rPr>
+          <w:highlight w:val="yellow"/>
+        </w:rPr>
+        <w:t>Pressure monitoring within the Bag-in-Box containers was carried out using custom-designed sensing units, as described in a previous study [19]. Each unit was built around an MS5803-05BA miniature altimeter module (TE Connectivity), a 24-bit MEMS pressure and temperature sensor with SPI and I2C interfaces. According to its data sheet [24], the device covers 0-5 bar and -40 to +85 °C. It resolves pressure to 0.036-0.195 mbar, depending on the oversampling ratio, and temperature to better than 0.01 °C. The specified pressure accuracy is ±1.5 mbar between 300 and 1100 mbar at 20 °C, widening to ±100 mbar over the full 0-5 bar and 0-50 °C envelope. Long-term pressure stability is specified as ±1 mbar per year, and temperature accuracy as ±2.5 °C. The sensor was driven by an ESP8285 microcontroller on an ESP-M2 board (Adafruit) [25] and powered by a lithium battery. The assembly was enclosed in an oil-filled plastic casing. The oil transmitted wine pressure to the transducer and dispersed the small amount of heat released by the electronics, whose draw is below 1 mA. The casing was introduced into each bag through the existing filling/dispensing valve before final sealing. The multilayer film was therefore not punctured. Sealing then followed the standard filling-line procedure, which was intended to minimise leakage and artificial perturbation of internal pressure.</w:t>
       </w:r>
     </w:p>
     <w:p>
@@ -1949,7 +1952,7 @@
         <w:rPr>
           <w:highlight w:val="yellow"/>
         </w:rPr>
-        <w:t>The pressure data were analysed separately because each instrumented BiB was described by stack position (top or bottom) and nominal chamber condition (19 °C or 50 °C set point). For each sensor, two summary responses were extracted from the ΔP curve: the peak reached after the handling window and within the 20-day storage period, and the residual value on day 20. Baseline pressure was the initial valid pressure reading at time zero for each sensor. Historical code used a t ≤ 0.02 d threshold, but the next available record is at 0.020833 d; therefore the reproduced ΔP values used the time-zero reading only, and the final scripts now select that value explicitly. The primary exploratory analysis used the additive two-way linear model</w:t>
+        <w:t>The pressure data were analysed separately because each instrumented BiB was described by stack position (top or bottom) and nominal chamber condition (19 °C or 50 °C set point). For each sensor, two summary responses were extracted from the ΔP curve: the peak reached after the handling window and within the 20-day storage period, and the residual value on day 20. Baseline pressure was the initial valid pressure reading at time zero for each sensor. Historical code used a t ≤ 0.02 d threshold. Because the next available record is at 0.020833 d, this threshold selected only the time-zero reading. The final scripts therefore select the initial valid pressure reading explicitly. The primary exploratory analysis used the additive two-way linear model</w:t>
       </w:r>
     </w:p>
     <w:p>
@@ -2099,7 +2102,7 @@
         <w:rPr>
           <w:highlight w:val="yellow"/>
         </w:rPr>
-        <w:t>The chemical comparison concerns wine from the main trial grouped by nominal chamber condition. The labels 19 °C and 50 °C in Table 2 denote chamber set points, not measured wine temperatures. In-bag sensors showed that, late in the main trial, the nominal 50 °C chamber produced actual package temperatures of 34.18 ± 0.36 °C at top sensors and 26.08 ± 0.23 °C at bottom sensors, while the nominal 19 °C chamber packages were about 23 °C (Section 3.2). The chemical results should therefore be read as differences associated with the nominally warmer chamber condition, not as the effect of exposing wine to 50 °C.</w:t>
+        <w:t>The chemical comparison concerns wine from the main trial grouped by nominal chamber condition. The labels 19 °C and 50 °C in Table 2 denote chamber set points, not measured wine temperatures. Late in the main trial, in-bag sensors showed that the nominal 50 °C chamber produced 34.18 ± 0.36 °C at top sensors and 26.08 ± 0.23 °C at bottom sensors. Packages in the nominal 19 °C chamber were about 23 °C (Section 3.2). The chemical results should therefore be read as differences associated with the nominally warmer chamber condition, not as the effect of exposing wine to 50 °C.</w:t>
       </w:r>
     </w:p>
     <w:p>
@@ -2112,7 +2115,7 @@
         <w:rPr>
           <w:highlight w:val="yellow"/>
         </w:rPr>
-        <w:t>Lactic acid was numerically higher in the wine from the nominally warmer chamber (0.29 ± 0.02 g/L) than in the reference (0.16 ± 0.05 g/L) (Table 2), but this difference is not treated as statistically verified because raw chemical replicates were unavailable. The 0.29 ± 0.02 g/L value is reported because it is traceable to the originally submitted Table 2; no primary experimental record supports the alternative 0.20 g/L SD. The available measurements do not justify assigning the numerical difference to a single mechanism. Malic acid did not decrease significantly (1.0 ± 0.16 g/L against 1.1 ± 0.23 g/L), which does not support a clear malolactic conversion pattern; however, no microbiological analyses, viable cell counts or method-sensitivity study were available. Residual microbial activity therefore cannot be ruled out. The result is reported as a descriptive compositional observation under the tested conditions rather than as evidence that malolactic fermentation was absent.</w:t>
+        <w:t>Lactic acid was numerically higher in the wine from the nominally warmer chamber (0.29 ± 0.02 g/L) than in the reference (0.16 ± 0.05 g/L) (Table 2). This difference is not treated as statistically verified because raw chemical replicates were unavailable. The 0.29 ± 0.02 g/L value is reported because it is traceable to the originally submitted Table 2; no primary experimental record supports the alternative 0.20 g/L SD. The available measurements do not identify the mechanism for this numerical difference. Malic acid did not decrease significantly (1.0 ± 0.16 g/L against 1.1 ± 0.23 g/L), so the data do not show a clear malolactic conversion pattern. However, no microbiological analyses, viable cell counts or method-sensitivity study were available. Residual microbial activity therefore cannot be ruled out. The result is reported as a descriptive compositional observation under the tested conditions, not as evidence that malolactic fermentation was absent.</w:t>
       </w:r>
     </w:p>
     <w:p>
@@ -2202,7 +2205,7 @@
         <w:rPr>
           <w:highlight w:val="yellow"/>
         </w:rPr>
-        <w:t>After the handling window, pressure rose in all units and peaked between about days 3.5 and 5.8, at about 56-94 mbar above each sensor's own baseline, before declining and partly recovering towards the end of the record. Mean peak ΔP was 83.0 ± 17.2 mbar in bottom units and 66.6 ± 10.1 mbar in top units under the nominal 50 °C chamber condition, and 84.8 ± 8.8 mbar in bottom units and 59.6 ± 5.1 mbar in top units under the nominal 19 °C condition (Figure 5A). In the exploratory sensor-level Type II two-way ANOVA, stack position was associated with peak ΔP (F(1,8) = 9.14; p = 0.017), with an adjusted bottom-minus-top difference of 20.4 mbar (95% CI 4.8-35.9 mbar). No statistically detectable nominal chamber-condition effect was observed (F(1,8) = 0.21; p = 0.66; adjusted nominal 50-minus-19 °C difference 3.1 mbar, 95% CI -12.5 to 18.6 mbar), and the interaction was not significant (p = 0.56). By day 20, neither position (F(1,8) = 0.35; p = 0.57; adjusted difference 5.2 mbar, 95% CI -15.3 to 25.7 mbar) nor nominal chamber condition (F(1,8) = 0.81; p = 0.39) was statistically detectable (Figure 5B). These results provide exploratory evidence for a transient position-associated pressure difference under the tested configuration, but the small and unbalanced design and absence of stack identifiers in the raw workbook limit precision and prevent a paired stack-level analysis.</w:t>
+        <w:t>After the handling window, pressure rose in all units and peaked between about days 3.5 and 5.8, at about 56-94 mbar above each sensor's own baseline. Pressure then declined and partly recovered towards the end of the record. Mean peak ΔP was 83.0 ± 17.2 mbar in bottom units and 66.6 ± 10.1 mbar in top units under the nominal 50 °C chamber condition. Under the nominal 19 °C condition, the corresponding values were 84.8 ± 8.8 mbar and 59.6 ± 5.1 mbar (Figure 5A). In the exploratory sensor-level Type II two-way ANOVA, stack position was associated with peak ΔP (F(1,8) = 9.14; p = 0.017). The adjusted bottom-minus-top difference was 20.4 mbar (95% CI 4.8-35.9 mbar). No statistically detectable nominal chamber-condition effect was observed (F(1,8) = 0.21; p = 0.66; adjusted nominal 50-minus-19 °C difference 3.1 mbar, 95% CI -12.5 to 18.6 mbar), and the interaction was not significant (p = 0.56). By day 20, neither position (F(1,8) = 0.35; p = 0.57; adjusted difference 5.2 mbar, 95% CI -15.3 to 25.7 mbar) nor nominal chamber condition (F(1,8) = 0.81; p = 0.39) was statistically detectable (Figure 5B). These results provide exploratory evidence for a position-associated pressure difference under the tested configuration. The difference was transient. Precision is limited by the small, unbalanced design and by the absence of stack identifiers, which prevents a paired stack-level analysis.</w:t>
       </w:r>
     </w:p>
     <w:p>
@@ -2214,7 +2217,7 @@
         <w:rPr>
           <w:highlight w:val="yellow"/>
         </w:rPr>
-        <w:t>The lower panels of Figure 3 show that the realised thermal exposure differed substantially from the nominal set points. In the nominal 19 °C chamber, late in-bag temperatures averaged 23.50 ± 0.21 °C in top units and 22.84 ± 0.30 °C in bottom units. In the nominal 50 °C chamber, packages warmed asymptotically but remained far below the set point: 34.18 ± 0.36 °C at the top of the stacks and 26.08 ± 0.23 °C at the bottom during the late storage window. The warmest individual main-trial sensor reached 35.3 °C. The vertical gradient of about 8 °C in the nominally hot chamber may reflect thermal inertia, chamber loading, limited heat transfer through the pallet, or airflow constraints, but the chamber model, airflow and occupancy data needed to diagnose the mechanism were not recorded. The pressure comparison between top and bottom positions must therefore be interpreted with the recognition that, in the nominally hot chamber, position also corresponded to different local package temperatures. The chamber comparison cannot be read as an actual 19 °C versus 50 °C wine-temperature contrast.</w:t>
+        <w:t>The lower panels of Figure 3 show that the realised thermal exposure differed substantially from the nominal set points. In the nominal 19 °C chamber, late in-bag temperatures averaged 23.50 ± 0.21 °C in top units and 22.84 ± 0.30 °C in bottom units. In the nominal 50 °C chamber, packages warmed gradually but remained far below the set point: 34.18 ± 0.36 °C at the top of the stacks and 26.08 ± 0.23 °C at the bottom during the late storage window. The warmest individual main-trial sensor reached 35.3 °C. The vertical gradient of about 8 °C in the nominally hot chamber may reflect thermal inertia, chamber loading, limited heat transfer through the pallet, or airflow constraints. However, the chamber model, airflow and occupancy data needed to diagnose the mechanism were not recorded. The pressure comparison between top and bottom positions must therefore be interpreted with the recognition that, in the nominally hot chamber, position also corresponded to different local package temperatures. The chamber comparison cannot be read as an actual 19 °C versus 50 °C wine-temperature contrast.</w:t>
       </w:r>
     </w:p>
     <w:p>
@@ -2225,7 +2228,7 @@
         <w:rPr>
           <w:highlight w:val="yellow"/>
         </w:rPr>
-        <w:t>Taken together, the physical and chemical measurements identify different response patterns, but they do not support a strict causal division between palletisation and temperature. The pressure measurements were position-resolved and showed a transient bottom-position peak in ΔP. The chemical measurements were bulk samples grouped by nominal chamber condition and were not resolved by stack position. Consequently, the data support the practical distinction that pressure monitoring can identify mechanically stressed package positions, while chemical measurements indicated lower SO₂ and selected acidity differences under the nominally warmer chamber condition; they do not demonstrate that palletisation and temperature act independently or exclusively on separate parts of the system.</w:t>
+        <w:t>Taken together, the physical and chemical measurements identify different response patterns, but they do not support a strict causal division between palletisation and temperature. The pressure measurements were position-resolved and showed a transient bottom-position peak in ΔP. The chemical measurements were bulk samples grouped by nominal chamber condition and were not resolved by stack position. The data support a practical distinction between the measurement types. Pressure monitoring identified mechanically stressed package positions. Bulk chemical measurements indicated lower SO₂ and selected acidity differences under the nominally warmer chamber condition. The study does not show that palletisation and temperature act independently or exclusively on separate parts of the system.</w:t>
       </w:r>
     </w:p>
     <w:p>
@@ -2332,7 +2335,7 @@
         <w:rPr>
           <w:highlight w:val="yellow"/>
         </w:rPr>
-        <w:t>Figure 5. Change in internal pressure referred to each sensor's own baseline (ΔP), by stack position and nominal chamber condition. (A) post-handling peak value; individual sensor peaks occurred between 85.0 and 138.5 h (about days 3.5-5.8). (B) residual value on day 20. Circles are individual sensors (n = 3 per position, except bottom position at nominal 19 °C, for which n = 2) and bars give mean ± 1 SD. At the pressurisation peak, bottom-position BiBs had a larger ΔP than top-position BiBs in the exploratory sensor-level analysis (two-way ANOVA, F(1,8) = 9.14; p = 0.017), while no statistically detectable nominal chamber-condition effect was observed (F(1,8) = 0.21; p = 0.66). By day 20 neither factor was statistically detectable.</w:t>
+        <w:t>Figure 5. Change in internal pressure referred to each sensor's own baseline (ΔP), by stack position and nominal chamber condition. (A) post-handling peak value; individual sensor peaks occurred between 85.0 and 138.5 h (about days 3.5-5.8). (B) residual value on day 20. Circles are individual sensors (n = 3 per position, except bottom position at nominal 19 °C, for which n = 2) and bars give mean ± 1 SD. At the pressurisation peak, bottom-position BiBs had a larger ΔP than top-position BiBs in the exploratory sensor-level analysis. The two-way ANOVA gave F(1,8) = 9.14 and p = 0.017. No statistically detectable nominal chamber-condition effect was observed (F(1,8) = 0.21; p = 0.66). By day 20 neither factor was statistically detectable.</w:t>
       </w:r>
     </w:p>
     <w:p>
@@ -3759,7 +3762,7 @@
         <w:rPr>
           <w:highlight w:val="yellow"/>
         </w:rPr>
-        <w:t>The pressure response in the verification trial was small and transient (Figure 7A). Referred to each sensor's first valid pressure, internal pressure rose by 9.6-26.5 mbar early in the record. The traces then declined, showed a common negative excursion near day 6, and returned towards near-baseline values later in the record while the wine was held at about 45-48 °C. This observation is consistent with a compliant container in which thermal expansion is partly accommodated by deformation of the flexible film rather than by sustained pressurisation. Because the verification trial used one stack and one configuration, it should be read as supporting evidence that this warmer in-bag exposure did not create sustained overpressure in that stack, not as proof that temperature cannot affect BiB pressure under all configurations.</w:t>
+        <w:t>The pressure response in the verification trial was small and transient (Figure 7A). Referred to each sensor's first valid pressure, internal pressure rose by 9.6-26.5 mbar early in the record. The traces then declined, showed a common negative excursion near day 6, and returned towards near-baseline values later in the record while the wine was held at about 45-48 °C. This observation is consistent with a compliant container in which thermal expansion is partly accommodated by deformation of the flexible film rather than by sustained pressurisation. Because the verification trial used one stack and one configuration, it should be read as supporting evidence for that stack only. It does not show that temperature cannot affect BiB pressure under other configurations.</w:t>
       </w:r>
     </w:p>
     <w:p>
@@ -3838,7 +3841,7 @@
         <w:rPr>
           <w:highlight w:val="yellow"/>
         </w:rPr>
-        <w:t>The pressure analysis is limited by eleven usable traces, one missing bottom-position sensor, an unbalanced cell of n = 2, possible within-stack pairing of top and bottom observations, and a narrow stack-height range in which height was not independently replicated. The raw workbook restores the pressure/temperature trajectories, but it does not retain stack IDs or sensor-to-stack pairings for a paired stack-level analysis. The first five hours were excluded from the primary storage analysis because they contained transport and stacking events; sensitivity analysis showed that including this window did not change the pressure-peak endpoint, but early transients may still be relevant to some logistics scenarios and the available early workbook block contains duplicated rows. The verification trial approached higher in-bag temperatures than the main trial, but it used a single three-box stack for 15 days, one sensor stopped at day 4.35, and no sensor reached 50 °C. Finally, this study did not include a techno-economic analysis of sensor deployment, so monitoring recommendations should be understood as sentinel, validation or quality-control uses rather than universal instrumentation of every commercial package.</w:t>
+        <w:t>The pressure analysis is limited by eleven usable traces, one missing bottom-position sensor, an unbalanced cell of n = 2, possible within-stack pairing of top and bottom observations, and a narrow stack-height range in which height was not independently replicated. The available raw workbook contains the pressure/temperature trajectories, but it does not retain stack IDs or sensor-to-stack pairings for a paired stack-level analysis. The first five hours were excluded from the primary storage analysis because they contained transport and stacking events. Sensitivity analysis showed that including this window did not change the pressure-peak endpoint. However, early transients may still be relevant to some logistics scenarios, and the available early workbook block contains duplicated rows. The verification trial approached higher in-bag temperatures than the main trial, but it used a single three-box stack for 15 days, one sensor stopped at day 4.35, and no sensor reached 50 °C. Finally, this study did not include a techno-economic analysis of sensor deployment, so monitoring recommendations should be understood as sentinel, validation or quality-control uses rather than universal instrumentation of every commercial package.</w:t>
       </w:r>
     </w:p>
     <w:p>
@@ -3884,7 +3887,7 @@
         <w:rPr>
           <w:highlight w:val="yellow"/>
         </w:rPr>
-        <w:t>For pressure, bottom-position BiBs had a larger mean peak ΔP than top-position BiBs under the tested stacking configuration, with an adjusted difference of 20.4 mbar in the exploratory sensor-level analysis (F(1,8) = 9.14; p = 0.017). Individual post-handling peaks occurred between about days 3.5 and 5.8, and including the first five hours did not change the peak-pressure endpoint. No statistically detectable nominal chamber-condition effect was observed in this small dataset, and by day 20 neither sensor-level factor remained significant. These findings are consistent with a transient contribution of package position or vertical load to peak pressurisation, followed by relaxation of the flexible bag system. The experiment does not provide a separate, well-powered test of stack height.</w:t>
+        <w:t>For pressure, bottom-position BiBs had a larger mean peak ΔP than top-position BiBs under the tested stacking configuration, with an adjusted difference of 20.4 mbar in the exploratory sensor-level analysis (F(1,8) = 9.14; p = 0.017). Individual post-handling peaks occurred between about days 3.5 and 5.8. The top-bottom difference was mainly observed during this pressurisation phase and became smaller later in storage. Including the first five hours did not change the peak-pressure endpoint. No statistically detectable nominal chamber-condition effect was observed in this small dataset, and by day 20 neither sensor-level factor was statistically detectable. Because the analysis is sensor-level and the chamber design was not replicated, this result should be interpreted as exploratory. The experiment does not provide a separate, well-powered test of stack height.</w:t>
       </w:r>
     </w:p>
     <w:p>

</xml_diff>